<commit_message>
Fix laminar flow report fields and uploads
Use assay-specific DOCX placeholders with formatted results, units and project codes, normalize fragmented tags, and remove the structured-record appendix. Validate parallelism as numeric angles and upload evidence with download-token metadata.
</commit_message>
<xml_diff>
--- a/functions/templates/fluxo_laminar.docx
+++ b/functions/templates/fluxo_laminar.docx
@@ -182,7 +182,7 @@
           <w:bCs/>
           <w:sz w:val="28"/>
         </w:rPr>
-        <w:t>{</w:t>
+        <w:t>{NOME DA MAQUINA}</w:t>
       </w:r>
       <w:r>
         <w:rPr>
@@ -191,7 +191,7 @@
           <w:bCs/>
           <w:sz w:val="28"/>
         </w:rPr>
-        <w:t>NOME DA MAQUINA</w:t>
+        <w:t/>
       </w:r>
       <w:r>
         <w:rPr>
@@ -200,7 +200,7 @@
           <w:bCs/>
           <w:sz w:val="28"/>
         </w:rPr>
-        <w:t>}</w:t>
+        <w:t/>
       </w:r>
     </w:p>
     <w:p>
@@ -1616,7 +1616,7 @@
           <w:sz w:val="20"/>
           <w:szCs w:val="20"/>
         </w:rPr>
-        <w:t xml:space="preserve">{NUMERO </w:t>
+        <w:t xml:space="preserve">{NUMERO DA MAQUINA}</w:t>
       </w:r>
       <w:r>
         <w:rPr>
@@ -1624,7 +1624,7 @@
           <w:sz w:val="20"/>
           <w:szCs w:val="20"/>
         </w:rPr>
-        <w:t>DA MAQUINA</w:t>
+        <w:t/>
       </w:r>
       <w:r>
         <w:rPr>
@@ -1632,7 +1632,7 @@
           <w:sz w:val="20"/>
           <w:szCs w:val="20"/>
         </w:rPr>
-        <w:t>}</w:t>
+        <w:t/>
       </w:r>
       <w:r>
         <w:rPr>
@@ -4685,7 +4685,7 @@
           <w:caps/>
           <w:szCs w:val="24"/>
         </w:rPr>
-        <w:t>{</w:t>
+        <w:t>{NOME DA MAQUINA}</w:t>
       </w:r>
       <w:r>
         <w:rPr>
@@ -4695,7 +4695,7 @@
           <w:caps/>
           <w:szCs w:val="24"/>
         </w:rPr>
-        <w:t>NOME DA MAQUINA</w:t>
+        <w:t/>
       </w:r>
       <w:r>
         <w:rPr>
@@ -4705,7 +4705,7 @@
           <w:caps/>
           <w:szCs w:val="24"/>
         </w:rPr>
-        <w:t>}</w:t>
+        <w:t/>
       </w:r>
       <w:r>
         <w:rPr>
@@ -7435,7 +7435,7 @@
                 <w:caps/>
                 <w:sz w:val="22"/>
               </w:rPr>
-              <w:t>{</w:t>
+              <w:t>{nome do sistema}</w:t>
             </w:r>
             <w:r>
               <w:rPr>
@@ -7445,7 +7445,7 @@
                 <w:caps/>
                 <w:sz w:val="22"/>
               </w:rPr>
-              <w:t>nome do sistema</w:t>
+              <w:t/>
             </w:r>
             <w:r>
               <w:rPr>
@@ -7455,7 +7455,7 @@
                 <w:caps/>
                 <w:sz w:val="22"/>
               </w:rPr>
-              <w:t>}</w:t>
+              <w:t/>
             </w:r>
           </w:p>
         </w:tc>
@@ -7524,23 +7524,23 @@
                 <w:sz w:val="20"/>
                 <w:szCs w:val="20"/>
               </w:rPr>
-              <w:t>{</w:t>
-            </w:r>
-            <w:r>
-              <w:rPr>
-                <w:rFonts w:ascii="Arial" w:hAnsi="Arial" w:cs="Arial"/>
-                <w:sz w:val="20"/>
-                <w:szCs w:val="20"/>
-              </w:rPr>
-              <w:t xml:space="preserve">DATA DO TESTE </w:t>
-            </w:r>
-            <w:r>
-              <w:rPr>
-                <w:rFonts w:ascii="Arial" w:hAnsi="Arial" w:cs="Arial"/>
-                <w:sz w:val="20"/>
-                <w:szCs w:val="20"/>
-              </w:rPr>
-              <w:t>}</w:t>
+              <w:t>{DATA DO TESTE }</w:t>
+            </w:r>
+            <w:r>
+              <w:rPr>
+                <w:rFonts w:ascii="Arial" w:hAnsi="Arial" w:cs="Arial"/>
+                <w:sz w:val="20"/>
+                <w:szCs w:val="20"/>
+              </w:rPr>
+              <w:t xml:space="preserve"/>
+            </w:r>
+            <w:r>
+              <w:rPr>
+                <w:rFonts w:ascii="Arial" w:hAnsi="Arial" w:cs="Arial"/>
+                <w:sz w:val="20"/>
+                <w:szCs w:val="20"/>
+              </w:rPr>
+              <w:t/>
             </w:r>
           </w:p>
         </w:tc>
@@ -7603,15 +7603,15 @@
                 <w:sz w:val="20"/>
                 <w:szCs w:val="20"/>
               </w:rPr>
-              <w:t>{</w:t>
-            </w:r>
-            <w:r>
-              <w:rPr>
-                <w:rFonts w:ascii="Arial" w:hAnsi="Arial" w:cs="Arial"/>
-                <w:sz w:val="20"/>
-                <w:szCs w:val="20"/>
-              </w:rPr>
-              <w:t>VALIDADE DO TESTE}</w:t>
+              <w:t>{VALIDADE DO TESTE}</w:t>
+            </w:r>
+            <w:r>
+              <w:rPr>
+                <w:rFonts w:ascii="Arial" w:hAnsi="Arial" w:cs="Arial"/>
+                <w:sz w:val="20"/>
+                <w:szCs w:val="20"/>
+              </w:rPr>
+              <w:t/>
             </w:r>
           </w:p>
         </w:tc>
@@ -7673,6 +7673,8 @@
                 <w:sz w:val="20"/>
                 <w:szCs w:val="20"/>
               </w:rPr>
+              <w:pageBreakBefore/>
+              <w:keepNext/>
             </w:pPr>
             <w:r>
               <w:rPr>
@@ -8563,7 +8565,7 @@
                 <w:sz w:val="14"/>
                 <w:szCs w:val="20"/>
               </w:rPr>
-              <w:t>{PONTO 1}</w:t>
+              <w:t>{ponto_aval_1}</w:t>
             </w:r>
           </w:p>
         </w:tc>
@@ -8625,7 +8627,7 @@
                 <w:sz w:val="20"/>
                 <w:szCs w:val="20"/>
               </w:rPr>
-              <w:t>{RESULTADO 1}</w:t>
+              <w:t>{res_aval_1}</w:t>
             </w:r>
           </w:p>
         </w:tc>
@@ -8802,7 +8804,7 @@
                 <w:sz w:val="14"/>
                 <w:szCs w:val="20"/>
               </w:rPr>
-              <w:t>{PONTO 2}</w:t>
+              <w:t>{ponto_aval_2}</w:t>
             </w:r>
           </w:p>
         </w:tc>
@@ -8853,7 +8855,7 @@
                 <w:sz w:val="20"/>
                 <w:szCs w:val="20"/>
               </w:rPr>
-              <w:t>{RESULTADO 2}</w:t>
+              <w:t>{res_aval_2}</w:t>
             </w:r>
           </w:p>
         </w:tc>
@@ -8995,7 +8997,7 @@
                 <w:sz w:val="14"/>
                 <w:szCs w:val="20"/>
               </w:rPr>
-              <w:t>{PONTO 3}</w:t>
+              <w:t>{ponto_aval_3}</w:t>
             </w:r>
           </w:p>
         </w:tc>
@@ -9053,7 +9055,7 @@
                 <w:sz w:val="20"/>
                 <w:szCs w:val="20"/>
               </w:rPr>
-              <w:t>{RESULTADO 3}</w:t>
+              <w:t>{res_aval_3}</w:t>
             </w:r>
           </w:p>
         </w:tc>
@@ -9219,23 +9221,23 @@
                 <w:sz w:val="20"/>
                 <w:szCs w:val="20"/>
               </w:rPr>
-              <w:t>{</w:t>
-            </w:r>
-            <w:r>
-              <w:rPr>
-                <w:rFonts w:ascii="Arial" w:hAnsi="Arial" w:cs="Arial"/>
-                <w:sz w:val="20"/>
-                <w:szCs w:val="20"/>
-              </w:rPr>
-              <w:t>FREQUENCIA MAQUINA</w:t>
-            </w:r>
-            <w:r>
-              <w:rPr>
-                <w:rFonts w:ascii="Arial" w:hAnsi="Arial" w:cs="Arial"/>
-                <w:sz w:val="20"/>
-                <w:szCs w:val="20"/>
-              </w:rPr>
-              <w:t>}</w:t>
+              <w:t>{FREQUENCIA MAQUINA}</w:t>
+            </w:r>
+            <w:r>
+              <w:rPr>
+                <w:rFonts w:ascii="Arial" w:hAnsi="Arial" w:cs="Arial"/>
+                <w:sz w:val="20"/>
+                <w:szCs w:val="20"/>
+              </w:rPr>
+              <w:t/>
+            </w:r>
+            <w:r>
+              <w:rPr>
+                <w:rFonts w:ascii="Arial" w:hAnsi="Arial" w:cs="Arial"/>
+                <w:sz w:val="20"/>
+                <w:szCs w:val="20"/>
+              </w:rPr>
+              <w:t/>
             </w:r>
           </w:p>
         </w:tc>
@@ -9360,15 +9362,15 @@
                 <w:sz w:val="20"/>
                 <w:szCs w:val="20"/>
               </w:rPr>
-              <w:t>{</w:t>
-            </w:r>
-            <w:r>
-              <w:rPr>
-                <w:rFonts w:ascii="Arial" w:hAnsi="Arial" w:cs="Arial"/>
-                <w:sz w:val="20"/>
-                <w:szCs w:val="20"/>
-              </w:rPr>
-              <w:t>OBS TECNICO}</w:t>
+              <w:t>{OBS TECNICO}</w:t>
+            </w:r>
+            <w:r>
+              <w:rPr>
+                <w:rFonts w:ascii="Arial" w:hAnsi="Arial" w:cs="Arial"/>
+                <w:sz w:val="20"/>
+                <w:szCs w:val="20"/>
+              </w:rPr>
+              <w:t/>
             </w:r>
           </w:p>
         </w:tc>
@@ -9945,7 +9947,6 @@
                 <w:sz w:val="20"/>
                 <w:szCs w:val="20"/>
               </w:rPr>
-              <w:lastRenderedPageBreak/>
               <w:t>Executado por:</w:t>
             </w:r>
             <w:r>
@@ -9962,23 +9963,23 @@
                 <w:sz w:val="20"/>
                 <w:szCs w:val="20"/>
               </w:rPr>
-              <w:t>{</w:t>
-            </w:r>
-            <w:r>
-              <w:rPr>
-                <w:rFonts w:ascii="Arial" w:hAnsi="Arial" w:cs="Arial"/>
-                <w:sz w:val="20"/>
-                <w:szCs w:val="20"/>
-              </w:rPr>
-              <w:t>NOME DO TECNICO</w:t>
-            </w:r>
-            <w:r>
-              <w:rPr>
-                <w:rFonts w:ascii="Arial" w:hAnsi="Arial" w:cs="Arial"/>
-                <w:sz w:val="20"/>
-                <w:szCs w:val="20"/>
-              </w:rPr>
-              <w:t>}</w:t>
+              <w:t>{NOME DO TECNICO}</w:t>
+            </w:r>
+            <w:r>
+              <w:rPr>
+                <w:rFonts w:ascii="Arial" w:hAnsi="Arial" w:cs="Arial"/>
+                <w:sz w:val="20"/>
+                <w:szCs w:val="20"/>
+              </w:rPr>
+              <w:t/>
+            </w:r>
+            <w:r>
+              <w:rPr>
+                <w:rFonts w:ascii="Arial" w:hAnsi="Arial" w:cs="Arial"/>
+                <w:sz w:val="20"/>
+                <w:szCs w:val="20"/>
+              </w:rPr>
+              <w:t/>
             </w:r>
           </w:p>
         </w:tc>
@@ -10097,23 +10098,23 @@
                 <w:sz w:val="20"/>
                 <w:szCs w:val="20"/>
               </w:rPr>
-              <w:t xml:space="preserve">{DATA </w:t>
-            </w:r>
-            <w:r>
-              <w:rPr>
-                <w:rFonts w:ascii="Arial" w:hAnsi="Arial" w:cs="Arial"/>
-                <w:sz w:val="20"/>
-                <w:szCs w:val="20"/>
-              </w:rPr>
-              <w:t>ELABORADOR</w:t>
-            </w:r>
-            <w:r>
-              <w:rPr>
-                <w:rFonts w:ascii="Arial" w:hAnsi="Arial" w:cs="Arial"/>
-                <w:sz w:val="20"/>
-                <w:szCs w:val="20"/>
-              </w:rPr>
-              <w:t>}</w:t>
+              <w:t xml:space="preserve">{DATA ELABORADOR}</w:t>
+            </w:r>
+            <w:r>
+              <w:rPr>
+                <w:rFonts w:ascii="Arial" w:hAnsi="Arial" w:cs="Arial"/>
+                <w:sz w:val="20"/>
+                <w:szCs w:val="20"/>
+              </w:rPr>
+              <w:t/>
+            </w:r>
+            <w:r>
+              <w:rPr>
+                <w:rFonts w:ascii="Arial" w:hAnsi="Arial" w:cs="Arial"/>
+                <w:sz w:val="20"/>
+                <w:szCs w:val="20"/>
+              </w:rPr>
+              <w:t/>
             </w:r>
           </w:p>
         </w:tc>
@@ -10179,6 +10180,8 @@
                 <w:sz w:val="22"/>
                 <w:szCs w:val="22"/>
               </w:rPr>
+              <w:pageBreakBefore/>
+              <w:keepNext/>
             </w:pPr>
             <w:r>
               <w:rPr>
@@ -10951,7 +10954,7 @@
                 <w:rFonts w:ascii="Verdana" w:hAnsi="Verdana"/>
                 <w:sz w:val="14"/>
               </w:rPr>
-              <w:t>{PONTO 1}</w:t>
+              <w:t>{ponto_vel_1}</w:t>
             </w:r>
           </w:p>
         </w:tc>
@@ -10977,7 +10980,7 @@
                 <w:sz w:val="20"/>
                 <w:szCs w:val="20"/>
               </w:rPr>
-              <w:t>{RESULTADO 1}</w:t>
+              <w:t>{res_vel_p1_f1}</w:t>
             </w:r>
           </w:p>
         </w:tc>
@@ -11003,7 +11006,7 @@
                 <w:sz w:val="20"/>
                 <w:szCs w:val="20"/>
               </w:rPr>
-              <w:t>{RESULTADO 1}</w:t>
+              <w:t>{res_vel_p1_f2}</w:t>
             </w:r>
           </w:p>
         </w:tc>
@@ -11029,7 +11032,7 @@
                 <w:sz w:val="20"/>
                 <w:szCs w:val="20"/>
               </w:rPr>
-              <w:t>{RESULTADO 1}</w:t>
+              <w:t>{res_vel_p1_f3}</w:t>
             </w:r>
           </w:p>
         </w:tc>
@@ -11055,7 +11058,7 @@
                 <w:sz w:val="20"/>
                 <w:szCs w:val="20"/>
               </w:rPr>
-              <w:t>{RESULTADO 1}</w:t>
+              <w:t>{res_vel_p1_f4}</w:t>
             </w:r>
           </w:p>
         </w:tc>
@@ -11080,7 +11083,7 @@
                 <w:sz w:val="20"/>
                 <w:szCs w:val="20"/>
               </w:rPr>
-              <w:t>{RESULTADO 1}</w:t>
+              <w:t>{res_vel_p1_f5}</w:t>
             </w:r>
           </w:p>
         </w:tc>
@@ -11118,7 +11121,7 @@
                 <w:rFonts w:ascii="Verdana" w:hAnsi="Verdana"/>
                 <w:sz w:val="14"/>
               </w:rPr>
-              <w:t>{PONTO 2}</w:t>
+              <w:t>{ponto_vel_2}</w:t>
             </w:r>
           </w:p>
         </w:tc>
@@ -11144,7 +11147,7 @@
                 <w:sz w:val="20"/>
                 <w:szCs w:val="20"/>
               </w:rPr>
-              <w:t>{RESULTADO 2}</w:t>
+              <w:t>{res_vel_p2_f1}</w:t>
             </w:r>
           </w:p>
         </w:tc>
@@ -11170,7 +11173,7 @@
                 <w:sz w:val="20"/>
                 <w:szCs w:val="20"/>
               </w:rPr>
-              <w:t>{RESULTADO 2}</w:t>
+              <w:t>{res_vel_p2_f2}</w:t>
             </w:r>
           </w:p>
         </w:tc>
@@ -11196,7 +11199,7 @@
                 <w:sz w:val="20"/>
                 <w:szCs w:val="20"/>
               </w:rPr>
-              <w:t>{RESULTADO 2}</w:t>
+              <w:t>{res_vel_p2_f3}</w:t>
             </w:r>
           </w:p>
         </w:tc>
@@ -11222,7 +11225,7 @@
                 <w:sz w:val="20"/>
                 <w:szCs w:val="20"/>
               </w:rPr>
-              <w:t>{RESULTADO 2}</w:t>
+              <w:t>{res_vel_p2_f4}</w:t>
             </w:r>
           </w:p>
         </w:tc>
@@ -11247,7 +11250,7 @@
                 <w:sz w:val="20"/>
                 <w:szCs w:val="20"/>
               </w:rPr>
-              <w:t>{RESULTADO 2}</w:t>
+              <w:t>{res_vel_p2_f5}</w:t>
             </w:r>
           </w:p>
         </w:tc>
@@ -11285,7 +11288,7 @@
                 <w:rFonts w:ascii="Verdana" w:hAnsi="Verdana"/>
                 <w:sz w:val="14"/>
               </w:rPr>
-              <w:t>{PONTO 3}</w:t>
+              <w:t>{ponto_vel_3}</w:t>
             </w:r>
           </w:p>
         </w:tc>
@@ -11311,7 +11314,7 @@
                 <w:sz w:val="20"/>
                 <w:szCs w:val="20"/>
               </w:rPr>
-              <w:t>{RESULTADO 3}</w:t>
+              <w:t>{res_vel_p3_f1}</w:t>
             </w:r>
           </w:p>
         </w:tc>
@@ -11337,7 +11340,7 @@
                 <w:sz w:val="20"/>
                 <w:szCs w:val="20"/>
               </w:rPr>
-              <w:t>{RESULTADO 3}</w:t>
+              <w:t>{res_vel_p3_f2}</w:t>
             </w:r>
           </w:p>
         </w:tc>
@@ -11363,7 +11366,7 @@
                 <w:sz w:val="20"/>
                 <w:szCs w:val="20"/>
               </w:rPr>
-              <w:t>{RESULTADO 3}</w:t>
+              <w:t>{res_vel_p3_f3}</w:t>
             </w:r>
           </w:p>
         </w:tc>
@@ -11389,7 +11392,7 @@
                 <w:sz w:val="20"/>
                 <w:szCs w:val="20"/>
               </w:rPr>
-              <w:t>{RESULTADO 3}</w:t>
+              <w:t>{res_vel_p3_f4}</w:t>
             </w:r>
           </w:p>
         </w:tc>
@@ -11414,7 +11417,7 @@
                 <w:sz w:val="20"/>
                 <w:szCs w:val="20"/>
               </w:rPr>
-              <w:t>{RESULTADO 3}</w:t>
+              <w:t>{res_vel_p3_f5}</w:t>
             </w:r>
           </w:p>
         </w:tc>
@@ -11884,7 +11887,7 @@
               <w:jc w:val="center"/>
             </w:pPr>
             <w:r>
-              <w:t>{Resultado 1}</w:t>
+              <w:t>{res_vel}</w:t>
             </w:r>
           </w:p>
         </w:tc>
@@ -11950,7 +11953,7 @@
                 <w:rFonts w:ascii="Arial" w:hAnsi="Arial" w:cs="Arial"/>
                 <w:sz w:val="20"/>
               </w:rPr>
-              <w:t>{Calculo resultado 1}</w:t>
+              <w:t>{cal_res_vel}</w:t>
             </w:r>
           </w:p>
         </w:tc>
@@ -13244,7 +13247,7 @@
               </w:rPr>
             </w:pPr>
             <w:r>
-              <w:t>{Resultado 1}</w:t>
+              <w:t>{res_media_vel}</w:t>
             </w:r>
           </w:p>
         </w:tc>
@@ -13342,6 +13345,9 @@
                 <w:lang w:eastAsia="es-CL"/>
               </w:rPr>
             </w:pPr>
+            <w:r>
+              <w:t xml:space="preserve">Cálculo: {cal_res_media_vel}</w:t>
+            </w:r>
             <w:r>
               <w:rPr>
                 <w:rFonts w:ascii="Arial" w:hAnsi="Arial" w:cs="Arial"/>
@@ -13826,7 +13832,6 @@
                 <w:sz w:val="20"/>
                 <w:szCs w:val="20"/>
               </w:rPr>
-              <w:lastRenderedPageBreak/>
               <w:t>Acompanhado por: {ELABORADOR}</w:t>
             </w:r>
           </w:p>
@@ -13947,6 +13952,8 @@
                 <w:sz w:val="22"/>
                 <w:szCs w:val="22"/>
               </w:rPr>
+              <w:pageBreakBefore/>
+              <w:keepNext/>
             </w:pPr>
             <w:r>
               <w:rPr>
@@ -14755,7 +14762,7 @@
                 <w:szCs w:val="20"/>
                 <w:lang w:eastAsia="es-CL"/>
               </w:rPr>
-              <w:t>{PONTO1}</w:t>
+              <w:t>{ponto_int_1}</w:t>
             </w:r>
           </w:p>
         </w:tc>
@@ -14821,7 +14828,7 @@
                 <w:sz w:val="20"/>
                 <w:szCs w:val="20"/>
               </w:rPr>
-              <w:t>{RESULTADO1}</w:t>
+              <w:t>{res_int}</w:t>
             </w:r>
           </w:p>
         </w:tc>
@@ -14899,7 +14906,7 @@
                 <w:sz w:val="18"/>
                 <w:szCs w:val="18"/>
               </w:rPr>
-              <w:t>{CALCULO RESULTADO}</w:t>
+              <w:t>{cal_res_int}</w:t>
             </w:r>
           </w:p>
         </w:tc>
@@ -15028,7 +15035,7 @@
                 <w:sz w:val="10"/>
                 <w:szCs w:val="18"/>
               </w:rPr>
-              <w:t>{PONTO2}</w:t>
+              <w:t>{ponto_int_2}</w:t>
             </w:r>
           </w:p>
         </w:tc>
@@ -15204,7 +15211,7 @@
                 <w:sz w:val="10"/>
                 <w:szCs w:val="18"/>
               </w:rPr>
-              <w:t>{PONTO3}</w:t>
+              <w:t>{ponto_int_3}</w:t>
             </w:r>
           </w:p>
         </w:tc>
@@ -15380,7 +15387,7 @@
                 <w:sz w:val="10"/>
                 <w:szCs w:val="18"/>
               </w:rPr>
-              <w:t>{PONTO4}</w:t>
+              <w:t>{ponto_int_4}</w:t>
             </w:r>
           </w:p>
         </w:tc>
@@ -18336,6 +18343,8 @@
                 <w:sz w:val="22"/>
                 <w:szCs w:val="22"/>
               </w:rPr>
+              <w:pageBreakBefore/>
+              <w:keepNext/>
             </w:pPr>
             <w:r>
               <w:rPr>
@@ -19331,21 +19340,21 @@
                 <w:rFonts w:ascii="Arial" w:hAnsi="Arial" w:cs="Arial"/>
                 <w:sz w:val="14"/>
               </w:rPr>
-              <w:t>{</w:t>
+              <w:t>{res_ruido_1}</w:t>
             </w:r>
             <w:r>
               <w:rPr>
                 <w:rFonts w:ascii="Arial" w:hAnsi="Arial" w:cs="Arial"/>
                 <w:sz w:val="14"/>
               </w:rPr>
-              <w:t>RESULTADO1</w:t>
+              <w:t/>
             </w:r>
             <w:r>
               <w:rPr>
                 <w:rFonts w:ascii="Arial" w:hAnsi="Arial" w:cs="Arial"/>
                 <w:sz w:val="14"/>
               </w:rPr>
-              <w:t>}</w:t>
+              <w:t/>
             </w:r>
           </w:p>
         </w:tc>
@@ -19376,7 +19385,7 @@
                 <w:sz w:val="14"/>
                 <w:szCs w:val="20"/>
               </w:rPr>
-              <w:t>{RESULTADO2}</w:t>
+              <w:t>{res_ruido_2}</w:t>
             </w:r>
           </w:p>
         </w:tc>
@@ -19407,7 +19416,7 @@
                 <w:sz w:val="14"/>
                 <w:szCs w:val="20"/>
               </w:rPr>
-              <w:t>{RESULTADO3}</w:t>
+              <w:t>{res_ruido_3}</w:t>
             </w:r>
           </w:p>
         </w:tc>
@@ -19438,7 +19447,7 @@
                 <w:sz w:val="14"/>
                 <w:szCs w:val="20"/>
               </w:rPr>
-              <w:t>{RESULTADO4}</w:t>
+              <w:t>{res_ruido_4}</w:t>
             </w:r>
           </w:p>
         </w:tc>
@@ -19469,7 +19478,7 @@
                 <w:sz w:val="14"/>
                 <w:szCs w:val="20"/>
               </w:rPr>
-              <w:t>{RESULTADO5}</w:t>
+              <w:t>{res_ruido_5}</w:t>
             </w:r>
           </w:p>
         </w:tc>
@@ -19547,7 +19556,7 @@
                 <w:rFonts w:ascii="Arial" w:hAnsi="Arial" w:cs="Arial"/>
                 <w:sz w:val="16"/>
               </w:rPr>
-              <w:t>{MEDIA RESULTADO}</w:t>
+              <w:t>{media_ruido}</w:t>
             </w:r>
           </w:p>
         </w:tc>
@@ -20694,6 +20703,8 @@
                 <w:sz w:val="22"/>
                 <w:szCs w:val="22"/>
               </w:rPr>
+              <w:pageBreakBefore/>
+              <w:keepNext/>
             </w:pPr>
             <w:r>
               <w:rPr>
@@ -21705,7 +21716,7 @@
                 <w:rFonts w:ascii="Arial" w:hAnsi="Arial" w:cs="Arial"/>
                 <w:sz w:val="12"/>
               </w:rPr>
-              <w:t>{RESULTADO1}</w:t>
+              <w:t>{res_lum_1}</w:t>
             </w:r>
           </w:p>
         </w:tc>
@@ -21743,7 +21754,7 @@
                 <w:rFonts w:ascii="Arial" w:hAnsi="Arial" w:cs="Arial"/>
                 <w:sz w:val="12"/>
               </w:rPr>
-              <w:t>{RESULTADO2}</w:t>
+              <w:t>{res_lum_2}</w:t>
             </w:r>
           </w:p>
         </w:tc>
@@ -21777,7 +21788,7 @@
                 <w:sz w:val="12"/>
                 <w:szCs w:val="20"/>
               </w:rPr>
-              <w:t>{RESULTADO3}</w:t>
+              <w:t>{res_lum_3}</w:t>
             </w:r>
           </w:p>
         </w:tc>
@@ -21811,7 +21822,7 @@
                 <w:sz w:val="12"/>
                 <w:szCs w:val="20"/>
               </w:rPr>
-              <w:t>{RESULTADO4}</w:t>
+              <w:t>{res_lum_4}</w:t>
             </w:r>
           </w:p>
         </w:tc>
@@ -21845,7 +21856,7 @@
                 <w:sz w:val="12"/>
                 <w:szCs w:val="20"/>
               </w:rPr>
-              <w:t>{RESULTADO5}</w:t>
+              <w:t>{res_lum_5}</w:t>
             </w:r>
           </w:p>
         </w:tc>
@@ -21923,7 +21934,7 @@
                 <w:rFonts w:ascii="Arial" w:hAnsi="Arial" w:cs="Arial"/>
                 <w:sz w:val="16"/>
               </w:rPr>
-              <w:t>{MEDIA RESULTADO}</w:t>
+              <w:t>{media_lum}</w:t>
             </w:r>
           </w:p>
         </w:tc>
@@ -23006,6 +23017,8 @@
                 <w:sz w:val="22"/>
                 <w:szCs w:val="22"/>
               </w:rPr>
+              <w:pageBreakBefore/>
+              <w:keepNext/>
             </w:pPr>
             <w:r>
               <w:rPr>
@@ -23951,7 +23964,7 @@
                 <w:sz w:val="18"/>
                 <w:szCs w:val="20"/>
               </w:rPr>
-              <w:t>{RESULTADO1.1}</w:t>
+              <w:t>{res_cont_1_05}</w:t>
             </w:r>
           </w:p>
         </w:tc>
@@ -23975,7 +23988,7 @@
                 <w:sz w:val="18"/>
                 <w:szCs w:val="20"/>
               </w:rPr>
-              <w:t>{RESULTADO1.2}</w:t>
+              <w:t>{res_cont_1_5}</w:t>
             </w:r>
           </w:p>
         </w:tc>
@@ -24086,7 +24099,7 @@
                 <w:sz w:val="18"/>
                 <w:szCs w:val="20"/>
               </w:rPr>
-              <w:t>{RESULTADO2.1}</w:t>
+              <w:t>{res_cont_2_05}</w:t>
             </w:r>
           </w:p>
         </w:tc>
@@ -24110,7 +24123,7 @@
                 <w:sz w:val="18"/>
                 <w:szCs w:val="20"/>
               </w:rPr>
-              <w:t>{RESULTADO2.2}</w:t>
+              <w:t>{res_cont_2_5}</w:t>
             </w:r>
           </w:p>
         </w:tc>
@@ -24221,7 +24234,7 @@
                 <w:sz w:val="18"/>
                 <w:szCs w:val="20"/>
               </w:rPr>
-              <w:t>{RESULTADO3.1}</w:t>
+              <w:t>{res_cont_3_05}</w:t>
             </w:r>
           </w:p>
         </w:tc>
@@ -24245,7 +24258,7 @@
                 <w:sz w:val="18"/>
                 <w:szCs w:val="20"/>
               </w:rPr>
-              <w:t>{RESULTADO3.2}</w:t>
+              <w:t>{res_cont_3_5}</w:t>
             </w:r>
           </w:p>
         </w:tc>
@@ -24383,7 +24396,7 @@
                 <w:sz w:val="18"/>
                 <w:szCs w:val="20"/>
               </w:rPr>
-              <w:t>{RESULTADO4.1}</w:t>
+              <w:t>{res_cont_4_05}</w:t>
             </w:r>
           </w:p>
         </w:tc>
@@ -24407,7 +24420,7 @@
                 <w:sz w:val="18"/>
                 <w:szCs w:val="20"/>
               </w:rPr>
-              <w:t>{RESULTADO4.2}</w:t>
+              <w:t>{res_cont_4_5}</w:t>
             </w:r>
           </w:p>
         </w:tc>
@@ -24518,7 +24531,7 @@
                 <w:sz w:val="18"/>
                 <w:szCs w:val="20"/>
               </w:rPr>
-              <w:t>{RESULTADO5.1}</w:t>
+              <w:t>{res_cont_5_05}</w:t>
             </w:r>
           </w:p>
         </w:tc>
@@ -24542,7 +24555,7 @@
                 <w:sz w:val="18"/>
                 <w:szCs w:val="20"/>
               </w:rPr>
-              <w:t>{RESULTADO5.2}</w:t>
+              <w:t>{res_cont_5_5}</w:t>
             </w:r>
           </w:p>
         </w:tc>
@@ -24653,7 +24666,7 @@
                 <w:sz w:val="18"/>
                 <w:szCs w:val="20"/>
               </w:rPr>
-              <w:t>{RESULTADO6.1}</w:t>
+              <w:t>{res_cont_6_05}</w:t>
             </w:r>
           </w:p>
         </w:tc>
@@ -24677,7 +24690,7 @@
                 <w:sz w:val="18"/>
                 <w:szCs w:val="20"/>
               </w:rPr>
-              <w:t>{RESULTADO6.2}</w:t>
+              <w:t>{res_cont_6_5}</w:t>
             </w:r>
           </w:p>
         </w:tc>
@@ -25651,6 +25664,8 @@
                 <w:sz w:val="22"/>
                 <w:szCs w:val="22"/>
               </w:rPr>
+              <w:pageBreakBefore/>
+              <w:keepNext/>
             </w:pPr>
             <w:r>
               <w:rPr>
@@ -26304,7 +26319,7 @@
                 <w:szCs w:val="20"/>
                 <w:lang w:eastAsia="es-CL"/>
               </w:rPr>
-              <w:t>{</w:t>
+              <w:t>{res_vis} </w:t>
             </w:r>
             <w:r>
               <w:rPr>
@@ -26313,7 +26328,7 @@
                 <w:szCs w:val="20"/>
                 <w:lang w:eastAsia="es-CL"/>
               </w:rPr>
-              <w:t>RESULTADO</w:t>
+              <w:t/>
             </w:r>
             <w:r>
               <w:rPr>
@@ -26322,7 +26337,7 @@
                 <w:szCs w:val="20"/>
                 <w:lang w:eastAsia="es-CL"/>
               </w:rPr>
-              <w:t xml:space="preserve">} </w:t>
+              <w:t xml:space="preserve"/>
             </w:r>
             <w:r>
               <w:rPr>
@@ -27565,6 +27580,8 @@
                 <w:sz w:val="20"/>
                 <w:szCs w:val="20"/>
               </w:rPr>
+              <w:pageBreakBefore/>
+              <w:keepNext/>
             </w:pPr>
             <w:r>
               <w:rPr>
@@ -30588,7 +30605,6 @@
                 <w:sz w:val="18"/>
                 <w:szCs w:val="18"/>
               </w:rPr>
-              <w:lastRenderedPageBreak/>
               <w:t>Nº DO PONTO</w:t>
             </w:r>
           </w:p>
@@ -30804,7 +30820,7 @@
                 <w:sz w:val="18"/>
                 <w:szCs w:val="18"/>
               </w:rPr>
-              <w:t>{</w:t>
+              <w:t>{res_para}</w:t>
             </w:r>
             <w:r>
               <w:rPr>
@@ -30812,7 +30828,7 @@
                 <w:sz w:val="18"/>
                 <w:szCs w:val="18"/>
               </w:rPr>
-              <w:t>RESULTADO</w:t>
+              <w:t/>
             </w:r>
             <w:r>
               <w:rPr>
@@ -30820,7 +30836,7 @@
                 <w:sz w:val="18"/>
                 <w:szCs w:val="18"/>
               </w:rPr>
-              <w:t>}</w:t>
+              <w:t/>
             </w:r>
           </w:p>
         </w:tc>
@@ -30849,7 +30865,7 @@
                 <w:sz w:val="18"/>
                 <w:szCs w:val="18"/>
               </w:rPr>
-              <w:t>{CALCULO RESULTADO}</w:t>
+              <w:t>{cal_res_para_1}</w:t>
             </w:r>
           </w:p>
         </w:tc>
@@ -30965,7 +30981,7 @@
                 <w:sz w:val="18"/>
                 <w:szCs w:val="18"/>
               </w:rPr>
-              <w:t>{RESULTADO}</w:t>
+              <w:t>{res_para_2}</w:t>
             </w:r>
           </w:p>
         </w:tc>
@@ -30994,7 +31010,7 @@
                 <w:sz w:val="18"/>
                 <w:szCs w:val="18"/>
               </w:rPr>
-              <w:t>{CALCULO RESULTADO}</w:t>
+              <w:t>{cal_res_para_2}</w:t>
             </w:r>
           </w:p>
         </w:tc>
@@ -31102,7 +31118,7 @@
                 <w:sz w:val="18"/>
                 <w:szCs w:val="18"/>
               </w:rPr>
-              <w:t>{RESULTADO}</w:t>
+              <w:t>{res_para_3}</w:t>
             </w:r>
           </w:p>
         </w:tc>
@@ -31131,7 +31147,7 @@
                 <w:sz w:val="18"/>
                 <w:szCs w:val="18"/>
               </w:rPr>
-              <w:t>{CALCULO RESULTADO}</w:t>
+              <w:t>{cal_res_para_3}</w:t>
             </w:r>
           </w:p>
         </w:tc>
@@ -31239,7 +31255,7 @@
                 <w:sz w:val="18"/>
                 <w:szCs w:val="18"/>
               </w:rPr>
-              <w:t>{RESULTADO}</w:t>
+              <w:t>{res_para_4}</w:t>
             </w:r>
           </w:p>
         </w:tc>
@@ -31268,7 +31284,7 @@
                 <w:sz w:val="18"/>
                 <w:szCs w:val="18"/>
               </w:rPr>
-              <w:t>{CALCULO RESULTADO}</w:t>
+              <w:t>{cal_res_para_4}</w:t>
             </w:r>
           </w:p>
         </w:tc>
@@ -31732,6 +31748,14 @@
           </w:tcPr>
           <w:p>
             <w:pPr>
+              <w:keepNext/>
+            </w:pPr>
+            <w:r>
+              <w:t>Maior angulo calculado: {cal_res_para}</w:t>
+            </w:r>
+          </w:p>
+          <w:p>
+            <w:pPr>
               <w:jc w:val="center"/>
               <w:rPr>
                 <w:rFonts w:ascii="Arial" w:hAnsi="Arial" w:cs="Arial"/>
@@ -32090,6 +32114,8 @@
                 <w:sz w:val="20"/>
                 <w:szCs w:val="20"/>
               </w:rPr>
+              <w:pageBreakBefore/>
+              <w:keepNext/>
             </w:pPr>
             <w:r>
               <w:rPr>
@@ -32099,7 +32125,6 @@
                 <w:sz w:val="20"/>
                 <w:szCs w:val="20"/>
               </w:rPr>
-              <w:br w:type="page"/>
               <w:t xml:space="preserve">Anexo </w:t>
             </w:r>
             <w:r>
@@ -33042,6 +33067,8 @@
                 <w:sz w:val="20"/>
                 <w:szCs w:val="20"/>
               </w:rPr>
+              <w:pageBreakBefore/>
+              <w:keepNext/>
             </w:pPr>
             <w:r>
               <w:rPr>
@@ -33051,7 +33078,6 @@
                 <w:sz w:val="20"/>
                 <w:szCs w:val="20"/>
               </w:rPr>
-              <w:br w:type="page"/>
               <w:t xml:space="preserve">Anexo </w:t>
             </w:r>
             <w:r>
@@ -34716,23 +34742,23 @@
                 <w:sz w:val="20"/>
                 <w:szCs w:val="20"/>
               </w:rPr>
-              <w:t>{</w:t>
-            </w:r>
-            <w:r>
-              <w:rPr>
-                <w:rFonts w:ascii="Arial" w:hAnsi="Arial" w:cs="Arial"/>
-                <w:sz w:val="20"/>
-                <w:szCs w:val="20"/>
-              </w:rPr>
-              <w:t>ASSINATURA ELABORADOR</w:t>
-            </w:r>
-            <w:r>
-              <w:rPr>
-                <w:rFonts w:ascii="Arial" w:hAnsi="Arial" w:cs="Arial"/>
-                <w:sz w:val="20"/>
-                <w:szCs w:val="20"/>
-              </w:rPr>
-              <w:t>}</w:t>
+              <w:t>{ASSINATURA ELABORADOR}</w:t>
+            </w:r>
+            <w:r>
+              <w:rPr>
+                <w:rFonts w:ascii="Arial" w:hAnsi="Arial" w:cs="Arial"/>
+                <w:sz w:val="20"/>
+                <w:szCs w:val="20"/>
+              </w:rPr>
+              <w:t/>
+            </w:r>
+            <w:r>
+              <w:rPr>
+                <w:rFonts w:ascii="Arial" w:hAnsi="Arial" w:cs="Arial"/>
+                <w:sz w:val="20"/>
+                <w:szCs w:val="20"/>
+              </w:rPr>
+              <w:t/>
             </w:r>
           </w:p>
         </w:tc>
@@ -34815,7 +34841,6 @@
           <w:sz w:val="20"/>
           <w:szCs w:val="20"/>
         </w:rPr>
-        <w:br w:type="page"/>
       </w:r>
     </w:p>
     <w:tbl>
@@ -34867,6 +34892,8 @@
                 <w:sz w:val="20"/>
                 <w:szCs w:val="20"/>
               </w:rPr>
+              <w:pageBreakBefore/>
+              <w:keepNext/>
             </w:pPr>
             <w:r>
               <w:rPr>
@@ -34876,8 +34903,6 @@
                 <w:sz w:val="20"/>
                 <w:szCs w:val="20"/>
               </w:rPr>
-              <w:lastRenderedPageBreak/>
-              <w:br w:type="page"/>
               <w:t xml:space="preserve">Anexo </w:t>
             </w:r>
             <w:r>
@@ -35625,7 +35650,7 @@
                 <w:sz w:val="20"/>
                 <w:szCs w:val="20"/>
               </w:rPr>
-              <w:t xml:space="preserve"> {</w:t>
+              <w:t xml:space="preserve"> {COMENT ELABORADOR}</w:t>
             </w:r>
             <w:r>
               <w:rPr>
@@ -35635,7 +35660,7 @@
                 <w:sz w:val="20"/>
                 <w:szCs w:val="20"/>
               </w:rPr>
-              <w:t>COMENT ELABORADOR</w:t>
+              <w:t/>
             </w:r>
             <w:r>
               <w:rPr>
@@ -35645,7 +35670,7 @@
                 <w:sz w:val="20"/>
                 <w:szCs w:val="20"/>
               </w:rPr>
-              <w:t>}</w:t>
+              <w:t/>
             </w:r>
           </w:p>
         </w:tc>
@@ -36483,617 +36508,6 @@
         </w:rPr>
       </w:pPr>
     </w:p>
-    <w:p>
-      <w:r>
-        <w:lastRenderedPageBreak/>
-        <w:br w:type="page"/>
-      </w:r>
-    </w:p>
-    <w:p>
-      <w:bookmarkStart w:id="33" w:name="REGISTRO_ESTRUTURADO_ENSAIOS"/>
-      <w:r>
-        <w:rPr>
-          <w:b/>
-          <w:sz w:val="28"/>
-        </w:rPr>
-        <w:lastRenderedPageBreak/>
-        <w:t>REGISTRO ESTRUTURADO DOS ENSAIOS</w:t>
-      </w:r>
-      <w:bookmarkEnd w:id="33"/>
-    </w:p>
-    <w:p>
-      <w:r>
-        <w:rPr>
-          <w:b/>
-        </w:rPr>
-        <w:t>MAQUINAS</w:t>
-      </w:r>
-    </w:p>
-    <w:tbl>
-      <w:tblPr>
-        <w:tblW w:w="0" w:type="auto"/>
-        <w:tblBorders>
-          <w:top w:val="single" w:sz="4" w:space="0" w:color="808080"/>
-          <w:left w:val="single" w:sz="4" w:space="0" w:color="808080"/>
-          <w:bottom w:val="single" w:sz="4" w:space="0" w:color="808080"/>
-          <w:right w:val="single" w:sz="4" w:space="0" w:color="808080"/>
-          <w:insideH w:val="single" w:sz="4" w:space="0" w:color="D0D0D0"/>
-          <w:insideV w:val="single" w:sz="4" w:space="0" w:color="D0D0D0"/>
-        </w:tblBorders>
-        <w:tblLook w:val="04A0" w:firstRow="1" w:lastRow="0" w:firstColumn="1" w:lastColumn="0" w:noHBand="0" w:noVBand="1"/>
-      </w:tblPr>
-      <w:tblGrid>
-        <w:gridCol w:w="2412"/>
-        <w:gridCol w:w="1072"/>
-        <w:gridCol w:w="2493"/>
-        <w:gridCol w:w="1629"/>
-        <w:gridCol w:w="2306"/>
-      </w:tblGrid>
-      <w:tr>
-        <w:tc>
-          <w:tcPr>
-            <w:tcW w:w="2200" w:type="dxa"/>
-          </w:tcPr>
-          <w:p>
-            <w:r>
-              <w:rPr>
-                <w:b/>
-              </w:rPr>
-              <w:t>Nome</w:t>
-            </w:r>
-          </w:p>
-        </w:tc>
-        <w:tc>
-          <w:tcPr>
-            <w:tcW w:w="1500" w:type="dxa"/>
-          </w:tcPr>
-          <w:p>
-            <w:r>
-              <w:rPr>
-                <w:b/>
-              </w:rPr>
-              <w:t>Numero</w:t>
-            </w:r>
-          </w:p>
-        </w:tc>
-        <w:tc>
-          <w:tcPr>
-            <w:tcW w:w="1800" w:type="dxa"/>
-          </w:tcPr>
-          <w:p>
-            <w:r>
-              <w:rPr>
-                <w:b/>
-              </w:rPr>
-              <w:t>Filtro terminal</w:t>
-            </w:r>
-          </w:p>
-        </w:tc>
-        <w:tc>
-          <w:tcPr>
-            <w:tcW w:w="3000" w:type="dxa"/>
-          </w:tcPr>
-          <w:p>
-            <w:r>
-              <w:rPr>
-                <w:b/>
-              </w:rPr>
-              <w:t>Filtros</w:t>
-            </w:r>
-          </w:p>
-        </w:tc>
-        <w:tc>
-          <w:tcPr>
-            <w:tcW w:w="2500" w:type="dxa"/>
-          </w:tcPr>
-          <w:p>
-            <w:r>
-              <w:rPr>
-                <w:b/>
-              </w:rPr>
-              <w:t>Salas</w:t>
-            </w:r>
-          </w:p>
-        </w:tc>
-      </w:tr>
-      <w:tr>
-        <w:tc>
-          <w:tcPr>
-            <w:tcW w:w="2200" w:type="dxa"/>
-          </w:tcPr>
-          <w:p>
-            <w:r>
-              <w:t>{#handlingUnits}{nome}</w:t>
-            </w:r>
-          </w:p>
-        </w:tc>
-        <w:tc>
-          <w:tcPr>
-            <w:tcW w:w="1500" w:type="dxa"/>
-          </w:tcPr>
-          <w:p>
-            <w:r>
-              <w:t>{numero}</w:t>
-            </w:r>
-          </w:p>
-        </w:tc>
-        <w:tc>
-          <w:tcPr>
-            <w:tcW w:w="1800" w:type="dxa"/>
-          </w:tcPr>
-          <w:p>
-            <w:r>
-              <w:t>{temFiltroTerminalTexto}</w:t>
-            </w:r>
-          </w:p>
-        </w:tc>
-        <w:tc>
-          <w:tcPr>
-            <w:tcW w:w="3000" w:type="dxa"/>
-          </w:tcPr>
-          <w:p>
-            <w:r>
-              <w:t>{filtrosResumo}</w:t>
-            </w:r>
-          </w:p>
-        </w:tc>
-        <w:tc>
-          <w:tcPr>
-            <w:tcW w:w="2500" w:type="dxa"/>
-          </w:tcPr>
-          <w:p>
-            <w:r>
-              <w:t>{salas}{/handlingUnits}</w:t>
-            </w:r>
-          </w:p>
-        </w:tc>
-      </w:tr>
-    </w:tbl>
-    <w:p>
-      <w:r>
-        <w:rPr>
-          <w:b/>
-        </w:rPr>
-        <w:t>SALAS E FILTROS</w:t>
-      </w:r>
-    </w:p>
-    <w:tbl>
-      <w:tblPr>
-        <w:tblW w:w="0" w:type="auto"/>
-        <w:tblBorders>
-          <w:top w:val="single" w:sz="4" w:space="0" w:color="808080"/>
-          <w:left w:val="single" w:sz="4" w:space="0" w:color="808080"/>
-          <w:bottom w:val="single" w:sz="4" w:space="0" w:color="808080"/>
-          <w:right w:val="single" w:sz="4" w:space="0" w:color="808080"/>
-          <w:insideH w:val="single" w:sz="4" w:space="0" w:color="D0D0D0"/>
-          <w:insideV w:val="single" w:sz="4" w:space="0" w:color="D0D0D0"/>
-        </w:tblBorders>
-        <w:tblLook w:val="04A0" w:firstRow="1" w:lastRow="0" w:firstColumn="1" w:lastColumn="0" w:noHBand="0" w:noVBand="1"/>
-      </w:tblPr>
-      <w:tblGrid>
-        <w:gridCol w:w="2069"/>
-        <w:gridCol w:w="1287"/>
-        <w:gridCol w:w="1392"/>
-        <w:gridCol w:w="2101"/>
-        <w:gridCol w:w="3063"/>
-      </w:tblGrid>
-      <w:tr>
-        <w:tc>
-          <w:tcPr>
-            <w:tcW w:w="2200" w:type="dxa"/>
-          </w:tcPr>
-          <w:p>
-            <w:r>
-              <w:rPr>
-                <w:b/>
-              </w:rPr>
-              <w:t>Sala</w:t>
-            </w:r>
-          </w:p>
-        </w:tc>
-        <w:tc>
-          <w:tcPr>
-            <w:tcW w:w="1500" w:type="dxa"/>
-          </w:tcPr>
-          <w:p>
-            <w:r>
-              <w:rPr>
-                <w:b/>
-              </w:rPr>
-              <w:t>Area (m2)</w:t>
-            </w:r>
-          </w:p>
-        </w:tc>
-        <w:tc>
-          <w:tcPr>
-            <w:tcW w:w="1500" w:type="dxa"/>
-          </w:tcPr>
-          <w:p>
-            <w:r>
-              <w:rPr>
-                <w:b/>
-              </w:rPr>
-              <w:t>Volume (m3)</w:t>
-            </w:r>
-          </w:p>
-        </w:tc>
-        <w:tc>
-          <w:tcPr>
-            <w:tcW w:w="2500" w:type="dxa"/>
-          </w:tcPr>
-          <w:p>
-            <w:r>
-              <w:rPr>
-                <w:b/>
-              </w:rPr>
-              <w:t>Maquina</w:t>
-            </w:r>
-          </w:p>
-        </w:tc>
-        <w:tc>
-          <w:tcPr>
-            <w:tcW w:w="3300" w:type="dxa"/>
-          </w:tcPr>
-          <w:p>
-            <w:r>
-              <w:rPr>
-                <w:b/>
-              </w:rPr>
-              <w:t>Filtros</w:t>
-            </w:r>
-          </w:p>
-        </w:tc>
-      </w:tr>
-      <w:tr>
-        <w:tc>
-          <w:tcPr>
-            <w:tcW w:w="2200" w:type="dxa"/>
-          </w:tcPr>
-          <w:p>
-            <w:r>
-              <w:t>{#salas}{nome}</w:t>
-            </w:r>
-          </w:p>
-        </w:tc>
-        <w:tc>
-          <w:tcPr>
-            <w:tcW w:w="1500" w:type="dxa"/>
-          </w:tcPr>
-          <w:p>
-            <w:r>
-              <w:t>{area}</w:t>
-            </w:r>
-          </w:p>
-        </w:tc>
-        <w:tc>
-          <w:tcPr>
-            <w:tcW w:w="1500" w:type="dxa"/>
-          </w:tcPr>
-          <w:p>
-            <w:r>
-              <w:t>{volume}</w:t>
-            </w:r>
-          </w:p>
-        </w:tc>
-        <w:tc>
-          <w:tcPr>
-            <w:tcW w:w="2500" w:type="dxa"/>
-          </w:tcPr>
-          <w:p>
-            <w:r>
-              <w:t>{maquina}</w:t>
-            </w:r>
-          </w:p>
-        </w:tc>
-        <w:tc>
-          <w:tcPr>
-            <w:tcW w:w="3300" w:type="dxa"/>
-          </w:tcPr>
-          <w:p>
-            <w:r>
-              <w:t>{filtrosResumo}{/salas}</w:t>
-            </w:r>
-          </w:p>
-        </w:tc>
-      </w:tr>
-    </w:tbl>
-    <w:p>
-      <w:r>
-        <w:rPr>
-          <w:b/>
-        </w:rPr>
-        <w:t>RESULTADOS DOS ENSAIOS</w:t>
-      </w:r>
-    </w:p>
-    <w:tbl>
-      <w:tblPr>
-        <w:tblW w:w="0" w:type="auto"/>
-        <w:tblBorders>
-          <w:top w:val="single" w:sz="4" w:space="0" w:color="808080"/>
-          <w:left w:val="single" w:sz="4" w:space="0" w:color="808080"/>
-          <w:bottom w:val="single" w:sz="4" w:space="0" w:color="808080"/>
-          <w:right w:val="single" w:sz="4" w:space="0" w:color="808080"/>
-          <w:insideH w:val="single" w:sz="4" w:space="0" w:color="D0D0D0"/>
-          <w:insideV w:val="single" w:sz="4" w:space="0" w:color="D0D0D0"/>
-        </w:tblBorders>
-        <w:tblLook w:val="04A0" w:firstRow="1" w:lastRow="0" w:firstColumn="1" w:lastColumn="0" w:noHBand="0" w:noVBand="1"/>
-      </w:tblPr>
-      <w:tblGrid>
-        <w:gridCol w:w="3796"/>
-        <w:gridCol w:w="816"/>
-        <w:gridCol w:w="1913"/>
-        <w:gridCol w:w="3387"/>
-      </w:tblGrid>
-      <w:tr>
-        <w:tc>
-          <w:tcPr>
-            <w:tcW w:w="2500" w:type="dxa"/>
-          </w:tcPr>
-          <w:p>
-            <w:r>
-              <w:rPr>
-                <w:b/>
-              </w:rPr>
-              <w:t>Ensaio</w:t>
-            </w:r>
-          </w:p>
-        </w:tc>
-        <w:tc>
-          <w:tcPr>
-            <w:tcW w:w="2200" w:type="dxa"/>
-          </w:tcPr>
-          <w:p>
-            <w:r>
-              <w:rPr>
-                <w:b/>
-              </w:rPr>
-              <w:t>Sala</w:t>
-            </w:r>
-          </w:p>
-        </w:tc>
-        <w:tc>
-          <w:tcPr>
-            <w:tcW w:w="1800" w:type="dxa"/>
-          </w:tcPr>
-          <w:p>
-            <w:r>
-              <w:rPr>
-                <w:b/>
-              </w:rPr>
-              <w:t>Conformidade</w:t>
-            </w:r>
-          </w:p>
-        </w:tc>
-        <w:tc>
-          <w:tcPr>
-            <w:tcW w:w="4500" w:type="dxa"/>
-          </w:tcPr>
-          <w:p>
-            <w:r>
-              <w:rPr>
-                <w:b/>
-              </w:rPr>
-              <w:t>Resumo</w:t>
-            </w:r>
-          </w:p>
-        </w:tc>
-      </w:tr>
-      <w:tr>
-        <w:tc>
-          <w:tcPr>
-            <w:tcW w:w="2500" w:type="dxa"/>
-          </w:tcPr>
-          <w:p>
-            <w:r>
-              <w:t>{#resultadosPorEnsaio}{ensaioTipo}</w:t>
-            </w:r>
-          </w:p>
-        </w:tc>
-        <w:tc>
-          <w:tcPr>
-            <w:tcW w:w="2200" w:type="dxa"/>
-          </w:tcPr>
-          <w:p>
-            <w:r>
-              <w:t>{sala}</w:t>
-            </w:r>
-          </w:p>
-        </w:tc>
-        <w:tc>
-          <w:tcPr>
-            <w:tcW w:w="1800" w:type="dxa"/>
-          </w:tcPr>
-          <w:p>
-            <w:r>
-              <w:t>{conformeTexto}</w:t>
-            </w:r>
-          </w:p>
-        </w:tc>
-        <w:tc>
-          <w:tcPr>
-            <w:tcW w:w="4500" w:type="dxa"/>
-          </w:tcPr>
-          <w:p>
-            <w:r>
-              <w:t>{resumo}{/resultadosPorEnsaio}</w:t>
-            </w:r>
-          </w:p>
-        </w:tc>
-      </w:tr>
-    </w:tbl>
-    <w:p>
-      <w:r>
-        <w:rPr>
-          <w:b/>
-        </w:rPr>
-        <w:t>PONTOS DE LEITURA</w:t>
-      </w:r>
-    </w:p>
-    <w:tbl>
-      <w:tblPr>
-        <w:tblW w:w="0" w:type="auto"/>
-        <w:tblBorders>
-          <w:top w:val="single" w:sz="4" w:space="0" w:color="808080"/>
-          <w:left w:val="single" w:sz="4" w:space="0" w:color="808080"/>
-          <w:bottom w:val="single" w:sz="4" w:space="0" w:color="808080"/>
-          <w:right w:val="single" w:sz="4" w:space="0" w:color="808080"/>
-          <w:insideH w:val="single" w:sz="4" w:space="0" w:color="D0D0D0"/>
-          <w:insideV w:val="single" w:sz="4" w:space="0" w:color="D0D0D0"/>
-        </w:tblBorders>
-        <w:tblLook w:val="04A0" w:firstRow="1" w:lastRow="0" w:firstColumn="1" w:lastColumn="0" w:noHBand="0" w:noVBand="1"/>
-      </w:tblPr>
-      <w:tblGrid>
-        <w:gridCol w:w="2818"/>
-        <w:gridCol w:w="696"/>
-        <w:gridCol w:w="855"/>
-        <w:gridCol w:w="1479"/>
-        <w:gridCol w:w="1649"/>
-        <w:gridCol w:w="2415"/>
-      </w:tblGrid>
-      <w:tr>
-        <w:tc>
-          <w:tcPr>
-            <w:tcW w:w="2200" w:type="dxa"/>
-          </w:tcPr>
-          <w:p>
-            <w:r>
-              <w:rPr>
-                <w:b/>
-              </w:rPr>
-              <w:t>Ensaio</w:t>
-            </w:r>
-          </w:p>
-        </w:tc>
-        <w:tc>
-          <w:tcPr>
-            <w:tcW w:w="1800" w:type="dxa"/>
-          </w:tcPr>
-          <w:p>
-            <w:r>
-              <w:rPr>
-                <w:b/>
-              </w:rPr>
-              <w:t>Sala</w:t>
-            </w:r>
-          </w:p>
-        </w:tc>
-        <w:tc>
-          <w:tcPr>
-            <w:tcW w:w="2500" w:type="dxa"/>
-          </w:tcPr>
-          <w:p>
-            <w:r>
-              <w:rPr>
-                <w:b/>
-              </w:rPr>
-              <w:t>Ponto / filtro</w:t>
-            </w:r>
-          </w:p>
-        </w:tc>
-        <w:tc>
-          <w:tcPr>
-            <w:tcW w:w="1500" w:type="dxa"/>
-          </w:tcPr>
-          <w:p>
-            <w:r>
-              <w:rPr>
-                <w:b/>
-              </w:rPr>
-              <w:t>Principal</w:t>
-            </w:r>
-          </w:p>
-        </w:tc>
-        <w:tc>
-          <w:tcPr>
-            <w:tcW w:w="1500" w:type="dxa"/>
-          </w:tcPr>
-          <w:p>
-            <w:r>
-              <w:rPr>
-                <w:b/>
-              </w:rPr>
-              <w:t>Secundario</w:t>
-            </w:r>
-          </w:p>
-        </w:tc>
-        <w:tc>
-          <w:tcPr>
-            <w:tcW w:w="1800" w:type="dxa"/>
-          </w:tcPr>
-          <w:p>
-            <w:r>
-              <w:rPr>
-                <w:b/>
-              </w:rPr>
-              <w:t>Estado</w:t>
-            </w:r>
-          </w:p>
-        </w:tc>
-      </w:tr>
-      <w:tr>
-        <w:tc>
-          <w:tcPr>
-            <w:tcW w:w="2200" w:type="dxa"/>
-          </w:tcPr>
-          <w:p>
-            <w:r>
-              <w:t>{#pontosPorEnsaio}{ensaioTipo}</w:t>
-            </w:r>
-          </w:p>
-        </w:tc>
-        <w:tc>
-          <w:tcPr>
-            <w:tcW w:w="1800" w:type="dxa"/>
-          </w:tcPr>
-          <w:p>
-            <w:r>
-              <w:t>{sala}</w:t>
-            </w:r>
-          </w:p>
-        </w:tc>
-        <w:tc>
-          <w:tcPr>
-            <w:tcW w:w="2500" w:type="dxa"/>
-          </w:tcPr>
-          <w:p>
-            <w:r>
-              <w:t>{rotulo}</w:t>
-            </w:r>
-          </w:p>
-        </w:tc>
-        <w:tc>
-          <w:tcPr>
-            <w:tcW w:w="1500" w:type="dxa"/>
-          </w:tcPr>
-          <w:p>
-            <w:r>
-              <w:t>{valorPrincipal}</w:t>
-            </w:r>
-          </w:p>
-        </w:tc>
-        <w:tc>
-          <w:tcPr>
-            <w:tcW w:w="1500" w:type="dxa"/>
-          </w:tcPr>
-          <w:p>
-            <w:r>
-              <w:t>{valorSecundario}</w:t>
-            </w:r>
-          </w:p>
-        </w:tc>
-        <w:tc>
-          <w:tcPr>
-            <w:tcW w:w="1800" w:type="dxa"/>
-          </w:tcPr>
-          <w:p>
-            <w:r>
-              <w:t>{estado}{/pontosPorEnsaio}</w:t>
-            </w:r>
-          </w:p>
-        </w:tc>
-      </w:tr>
-    </w:tbl>
-    <w:p/>
     <w:sectPr>
       <w:headerReference w:type="default" r:id="rId16"/>
       <w:footerReference w:type="default" r:id="rId17"/>

</xml_diff>